<commit_message>
docs: Add initial summary report document for Task 1.
</commit_message>
<xml_diff>
--- a/jesus_data_clean/informes/Informe_Tarea1_Resumen.docx
+++ b/jesus_data_clean/informes/Informe_Tarea1_Resumen.docx
@@ -361,7 +361,7 @@
               <w:rPr>
                 <w:sz w:val="20"/>
               </w:rPr>
-              <w:t>Contexto macro</w:t>
+              <w:t>Contexto macro desfavorable</w:t>
             </w:r>
           </w:p>
         </w:tc>
@@ -575,7 +575,7 @@
               <w:rPr>
                 <w:sz w:val="20"/>
               </w:rPr>
-              <w:t>19.41%</w:t>
+              <w:t>45.49%</w:t>
             </w:r>
           </w:p>
         </w:tc>
@@ -591,7 +591,7 @@
               <w:rPr>
                 <w:sz w:val="20"/>
               </w:rPr>
-              <w:t>Patron en U: jovenes y mayores</w:t>
+              <w:t>Patron no lineal en U (ver abajo)</w:t>
             </w:r>
           </w:p>
         </w:tc>
@@ -801,6 +801,445 @@
         <w:pStyle w:val="Heading1"/>
       </w:pPr>
       <w:r>
+        <w:t>Edad: Relacion No Lineal (Patron en U)</w:t>
+      </w:r>
+    </w:p>
+    <w:p>
+      <w:r>
+        <w:t>La edad no tiene una relacion lineal con la suscripcion. Los jovenes y los mayores convierten significativamente mas que el rango central:</w:t>
+      </w:r>
+    </w:p>
+    <w:tbl>
+      <w:tblPr>
+        <w:tblStyle w:val="LightGrid-Accent1"/>
+        <w:tblW w:type="auto" w:w="0"/>
+        <w:jc w:val="center"/>
+        <w:tblLook w:firstColumn="1" w:firstRow="1" w:lastColumn="0" w:lastRow="0" w:noHBand="0" w:noVBand="1" w:val="04A0"/>
+      </w:tblPr>
+      <w:tblGrid>
+        <w:gridCol w:w="2160"/>
+        <w:gridCol w:w="2160"/>
+        <w:gridCol w:w="2160"/>
+        <w:gridCol w:w="2160"/>
+      </w:tblGrid>
+      <w:tr>
+        <w:tc>
+          <w:tcPr>
+            <w:tcW w:type="dxa" w:w="2160"/>
+          </w:tcPr>
+          <w:p>
+            <w:pPr>
+              <w:jc w:val="center"/>
+            </w:pPr>
+            <w:r>
+              <w:rPr>
+                <w:b/>
+                <w:sz w:val="20"/>
+              </w:rPr>
+              <w:t>Banda</w:t>
+            </w:r>
+          </w:p>
+        </w:tc>
+        <w:tc>
+          <w:tcPr>
+            <w:tcW w:type="dxa" w:w="2160"/>
+          </w:tcPr>
+          <w:p>
+            <w:pPr>
+              <w:jc w:val="center"/>
+            </w:pPr>
+            <w:r>
+              <w:rPr>
+                <w:b/>
+                <w:sz w:val="20"/>
+              </w:rPr>
+              <w:t>n</w:t>
+            </w:r>
+          </w:p>
+        </w:tc>
+        <w:tc>
+          <w:tcPr>
+            <w:tcW w:type="dxa" w:w="2160"/>
+          </w:tcPr>
+          <w:p>
+            <w:pPr>
+              <w:jc w:val="center"/>
+            </w:pPr>
+            <w:r>
+              <w:rPr>
+                <w:b/>
+                <w:sz w:val="20"/>
+              </w:rPr>
+              <w:t>Conversion</w:t>
+            </w:r>
+          </w:p>
+        </w:tc>
+        <w:tc>
+          <w:tcPr>
+            <w:tcW w:type="dxa" w:w="2160"/>
+          </w:tcPr>
+          <w:p>
+            <w:pPr>
+              <w:jc w:val="center"/>
+            </w:pPr>
+            <w:r>
+              <w:rPr>
+                <w:b/>
+                <w:sz w:val="20"/>
+              </w:rPr>
+              <w:t>vs. Media (11.27%)</w:t>
+            </w:r>
+          </w:p>
+        </w:tc>
+      </w:tr>
+      <w:tr>
+        <w:tc>
+          <w:tcPr>
+            <w:tcW w:type="dxa" w:w="2160"/>
+          </w:tcPr>
+          <w:p>
+            <w:pPr>
+              <w:jc w:val="center"/>
+            </w:pPr>
+            <w:r>
+              <w:rPr>
+                <w:sz w:val="20"/>
+              </w:rPr>
+              <w:t>&lt; 30 anos</w:t>
+            </w:r>
+          </w:p>
+        </w:tc>
+        <w:tc>
+          <w:tcPr>
+            <w:tcW w:type="dxa" w:w="2160"/>
+          </w:tcPr>
+          <w:p>
+            <w:pPr>
+              <w:jc w:val="center"/>
+            </w:pPr>
+            <w:r>
+              <w:rPr>
+                <w:sz w:val="20"/>
+              </w:rPr>
+              <w:t>7.383</w:t>
+            </w:r>
+          </w:p>
+        </w:tc>
+        <w:tc>
+          <w:tcPr>
+            <w:tcW w:type="dxa" w:w="2160"/>
+          </w:tcPr>
+          <w:p>
+            <w:pPr>
+              <w:jc w:val="center"/>
+            </w:pPr>
+            <w:r>
+              <w:rPr>
+                <w:sz w:val="20"/>
+              </w:rPr>
+              <w:t>15.22%</w:t>
+            </w:r>
+          </w:p>
+        </w:tc>
+        <w:tc>
+          <w:tcPr>
+            <w:tcW w:type="dxa" w:w="2160"/>
+          </w:tcPr>
+          <w:p>
+            <w:pPr>
+              <w:jc w:val="center"/>
+            </w:pPr>
+            <w:r>
+              <w:rPr>
+                <w:sz w:val="20"/>
+              </w:rPr>
+              <w:t>+3.96pp</w:t>
+            </w:r>
+          </w:p>
+        </w:tc>
+      </w:tr>
+      <w:tr>
+        <w:tc>
+          <w:tcPr>
+            <w:tcW w:type="dxa" w:w="2160"/>
+          </w:tcPr>
+          <w:p>
+            <w:pPr>
+              <w:jc w:val="center"/>
+            </w:pPr>
+            <w:r>
+              <w:rPr>
+                <w:sz w:val="20"/>
+              </w:rPr>
+              <w:t>30-40</w:t>
+            </w:r>
+          </w:p>
+        </w:tc>
+        <w:tc>
+          <w:tcPr>
+            <w:tcW w:type="dxa" w:w="2160"/>
+          </w:tcPr>
+          <w:p>
+            <w:pPr>
+              <w:jc w:val="center"/>
+            </w:pPr>
+            <w:r>
+              <w:rPr>
+                <w:sz w:val="20"/>
+              </w:rPr>
+              <w:t>16.385</w:t>
+            </w:r>
+          </w:p>
+        </w:tc>
+        <w:tc>
+          <w:tcPr>
+            <w:tcW w:type="dxa" w:w="2160"/>
+          </w:tcPr>
+          <w:p>
+            <w:pPr>
+              <w:jc w:val="center"/>
+            </w:pPr>
+            <w:r>
+              <w:rPr>
+                <w:sz w:val="20"/>
+              </w:rPr>
+              <w:t>9.75%</w:t>
+            </w:r>
+          </w:p>
+        </w:tc>
+        <w:tc>
+          <w:tcPr>
+            <w:tcW w:type="dxa" w:w="2160"/>
+          </w:tcPr>
+          <w:p>
+            <w:pPr>
+              <w:jc w:val="center"/>
+            </w:pPr>
+            <w:r>
+              <w:rPr>
+                <w:sz w:val="20"/>
+              </w:rPr>
+              <w:t>-1.52pp</w:t>
+            </w:r>
+          </w:p>
+        </w:tc>
+      </w:tr>
+      <w:tr>
+        <w:tc>
+          <w:tcPr>
+            <w:tcW w:type="dxa" w:w="2160"/>
+          </w:tcPr>
+          <w:p>
+            <w:pPr>
+              <w:jc w:val="center"/>
+            </w:pPr>
+            <w:r>
+              <w:rPr>
+                <w:sz w:val="20"/>
+              </w:rPr>
+              <w:t>41-50</w:t>
+            </w:r>
+          </w:p>
+        </w:tc>
+        <w:tc>
+          <w:tcPr>
+            <w:tcW w:type="dxa" w:w="2160"/>
+          </w:tcPr>
+          <w:p>
+            <w:pPr>
+              <w:jc w:val="center"/>
+            </w:pPr>
+            <w:r>
+              <w:rPr>
+                <w:sz w:val="20"/>
+              </w:rPr>
+              <w:t>10.240</w:t>
+            </w:r>
+          </w:p>
+        </w:tc>
+        <w:tc>
+          <w:tcPr>
+            <w:tcW w:type="dxa" w:w="2160"/>
+          </w:tcPr>
+          <w:p>
+            <w:pPr>
+              <w:jc w:val="center"/>
+            </w:pPr>
+            <w:r>
+              <w:rPr>
+                <w:sz w:val="20"/>
+              </w:rPr>
+              <w:t>8.17%</w:t>
+            </w:r>
+          </w:p>
+        </w:tc>
+        <w:tc>
+          <w:tcPr>
+            <w:tcW w:type="dxa" w:w="2160"/>
+          </w:tcPr>
+          <w:p>
+            <w:pPr>
+              <w:jc w:val="center"/>
+            </w:pPr>
+            <w:r>
+              <w:rPr>
+                <w:sz w:val="20"/>
+              </w:rPr>
+              <w:t>-3.09pp</w:t>
+            </w:r>
+          </w:p>
+        </w:tc>
+      </w:tr>
+      <w:tr>
+        <w:tc>
+          <w:tcPr>
+            <w:tcW w:type="dxa" w:w="2160"/>
+          </w:tcPr>
+          <w:p>
+            <w:pPr>
+              <w:jc w:val="center"/>
+            </w:pPr>
+            <w:r>
+              <w:rPr>
+                <w:sz w:val="20"/>
+              </w:rPr>
+              <w:t>51-60</w:t>
+            </w:r>
+          </w:p>
+        </w:tc>
+        <w:tc>
+          <w:tcPr>
+            <w:tcW w:type="dxa" w:w="2160"/>
+          </w:tcPr>
+          <w:p>
+            <w:pPr>
+              <w:jc w:val="center"/>
+            </w:pPr>
+            <w:r>
+              <w:rPr>
+                <w:sz w:val="20"/>
+              </w:rPr>
+              <w:t>6.270</w:t>
+            </w:r>
+          </w:p>
+        </w:tc>
+        <w:tc>
+          <w:tcPr>
+            <w:tcW w:type="dxa" w:w="2160"/>
+          </w:tcPr>
+          <w:p>
+            <w:pPr>
+              <w:jc w:val="center"/>
+            </w:pPr>
+            <w:r>
+              <w:rPr>
+                <w:sz w:val="20"/>
+              </w:rPr>
+              <w:t>10.65%</w:t>
+            </w:r>
+          </w:p>
+        </w:tc>
+        <w:tc>
+          <w:tcPr>
+            <w:tcW w:type="dxa" w:w="2160"/>
+          </w:tcPr>
+          <w:p>
+            <w:pPr>
+              <w:jc w:val="center"/>
+            </w:pPr>
+            <w:r>
+              <w:rPr>
+                <w:sz w:val="20"/>
+              </w:rPr>
+              <w:t>-0.61pp</w:t>
+            </w:r>
+          </w:p>
+        </w:tc>
+      </w:tr>
+      <w:tr>
+        <w:tc>
+          <w:tcPr>
+            <w:tcW w:type="dxa" w:w="2160"/>
+          </w:tcPr>
+          <w:p>
+            <w:pPr>
+              <w:jc w:val="center"/>
+            </w:pPr>
+            <w:r>
+              <w:rPr>
+                <w:sz w:val="20"/>
+              </w:rPr>
+              <w:t>60+</w:t>
+            </w:r>
+          </w:p>
+        </w:tc>
+        <w:tc>
+          <w:tcPr>
+            <w:tcW w:type="dxa" w:w="2160"/>
+          </w:tcPr>
+          <w:p>
+            <w:pPr>
+              <w:jc w:val="center"/>
+            </w:pPr>
+            <w:r>
+              <w:rPr>
+                <w:sz w:val="20"/>
+              </w:rPr>
+              <w:t>910</w:t>
+            </w:r>
+          </w:p>
+        </w:tc>
+        <w:tc>
+          <w:tcPr>
+            <w:tcW w:type="dxa" w:w="2160"/>
+          </w:tcPr>
+          <w:p>
+            <w:pPr>
+              <w:jc w:val="center"/>
+            </w:pPr>
+            <w:r>
+              <w:rPr>
+                <w:sz w:val="20"/>
+              </w:rPr>
+              <w:t>45.49%</w:t>
+            </w:r>
+          </w:p>
+        </w:tc>
+        <w:tc>
+          <w:tcPr>
+            <w:tcW w:type="dxa" w:w="2160"/>
+          </w:tcPr>
+          <w:p>
+            <w:pPr>
+              <w:jc w:val="center"/>
+            </w:pPr>
+            <w:r>
+              <w:rPr>
+                <w:sz w:val="20"/>
+              </w:rPr>
+              <w:t>+34.23pp</w:t>
+            </w:r>
+          </w:p>
+        </w:tc>
+      </w:tr>
+    </w:tbl>
+    <w:p/>
+    <w:p>
+      <w:r>
+        <w:rPr>
+          <w:b/>
+        </w:rPr>
+        <w:t xml:space="preserve">Test: </w:t>
+      </w:r>
+      <w:r>
+        <w:t>Mann-Whitney U, p=0.016 -&gt; Significativa. Esta no linealidad se capturara en el modelo predictivo (Tarea 3) con bins o transformaciones polinomicas.</w:t>
+      </w:r>
+    </w:p>
+    <w:p>
+      <w:pPr>
+        <w:pStyle w:val="Heading1"/>
+      </w:pPr>
+      <w:r>
         <w:t>Unknowns: No Son Datos Faltantes</w:t>
       </w:r>
     </w:p>
@@ -953,7 +1392,7 @@
               <w:rPr>
                 <w:sz w:val="20"/>
               </w:rPr>
-              <w:t>Mitad que "no" — son conservadores sin historial</w:t>
+              <w:t>Mitad que "no" — conservadores sin historial</w:t>
             </w:r>
           </w:p>
         </w:tc>
@@ -1163,12 +1602,646 @@
         <w:pStyle w:val="Heading1"/>
       </w:pPr>
       <w:r>
-        <w:t>Patron Macroeconomico</w:t>
+        <w:t>Variables Macroeconomicas: Las 5 Son Significativas</w:t>
       </w:r>
     </w:p>
     <w:p>
       <w:r>
-        <w:t>Las 5 variables macroeconomicas son significativas. El patron es claro: los depositos a plazo se contratan MAS en periodos de incertidumbre (euribor bajo, empleo en descenso). Esto tiene sentido economico: los depositos son un refugio seguro cuando el mercado es inestable.</w:t>
+        <w:t>Todas las variables macroeconomicas fueron analizadas con tests formales (Mann-Whitney U). Las 5 son estadisticamente significativas (p &lt; 0.001):</w:t>
+      </w:r>
+    </w:p>
+    <w:tbl>
+      <w:tblPr>
+        <w:tblStyle w:val="LightGrid-Accent1"/>
+        <w:tblW w:type="auto" w:w="0"/>
+        <w:jc w:val="center"/>
+        <w:tblLook w:firstColumn="1" w:firstRow="1" w:lastColumn="0" w:lastRow="0" w:noHBand="0" w:noVBand="1" w:val="04A0"/>
+      </w:tblPr>
+      <w:tblGrid>
+        <w:gridCol w:w="1440"/>
+        <w:gridCol w:w="1440"/>
+        <w:gridCol w:w="1440"/>
+        <w:gridCol w:w="1440"/>
+        <w:gridCol w:w="1440"/>
+        <w:gridCol w:w="1440"/>
+      </w:tblGrid>
+      <w:tr>
+        <w:tc>
+          <w:tcPr>
+            <w:tcW w:type="dxa" w:w="1440"/>
+          </w:tcPr>
+          <w:p>
+            <w:pPr>
+              <w:jc w:val="center"/>
+            </w:pPr>
+            <w:r>
+              <w:rPr>
+                <w:b/>
+                <w:sz w:val="20"/>
+              </w:rPr>
+              <w:t>Variable</w:t>
+            </w:r>
+          </w:p>
+        </w:tc>
+        <w:tc>
+          <w:tcPr>
+            <w:tcW w:type="dxa" w:w="1440"/>
+          </w:tcPr>
+          <w:p>
+            <w:pPr>
+              <w:jc w:val="center"/>
+            </w:pPr>
+            <w:r>
+              <w:rPr>
+                <w:b/>
+                <w:sz w:val="20"/>
+              </w:rPr>
+              <w:t>Corr. con y</w:t>
+            </w:r>
+          </w:p>
+        </w:tc>
+        <w:tc>
+          <w:tcPr>
+            <w:tcW w:type="dxa" w:w="1440"/>
+          </w:tcPr>
+          <w:p>
+            <w:pPr>
+              <w:jc w:val="center"/>
+            </w:pPr>
+            <w:r>
+              <w:rPr>
+                <w:b/>
+                <w:sz w:val="20"/>
+              </w:rPr>
+              <w:t>Media (yes)</w:t>
+            </w:r>
+          </w:p>
+        </w:tc>
+        <w:tc>
+          <w:tcPr>
+            <w:tcW w:type="dxa" w:w="1440"/>
+          </w:tcPr>
+          <w:p>
+            <w:pPr>
+              <w:jc w:val="center"/>
+            </w:pPr>
+            <w:r>
+              <w:rPr>
+                <w:b/>
+                <w:sz w:val="20"/>
+              </w:rPr>
+              <w:t>Media (no)</w:t>
+            </w:r>
+          </w:p>
+        </w:tc>
+        <w:tc>
+          <w:tcPr>
+            <w:tcW w:type="dxa" w:w="1440"/>
+          </w:tcPr>
+          <w:p>
+            <w:pPr>
+              <w:jc w:val="center"/>
+            </w:pPr>
+            <w:r>
+              <w:rPr>
+                <w:b/>
+                <w:sz w:val="20"/>
+              </w:rPr>
+              <w:t>p-value</w:t>
+            </w:r>
+          </w:p>
+        </w:tc>
+        <w:tc>
+          <w:tcPr>
+            <w:tcW w:type="dxa" w:w="1440"/>
+          </w:tcPr>
+          <w:p>
+            <w:pPr>
+              <w:jc w:val="center"/>
+            </w:pPr>
+            <w:r>
+              <w:rPr>
+                <w:b/>
+                <w:sz w:val="20"/>
+              </w:rPr>
+              <w:t>Efecto</w:t>
+            </w:r>
+          </w:p>
+        </w:tc>
+      </w:tr>
+      <w:tr>
+        <w:tc>
+          <w:tcPr>
+            <w:tcW w:type="dxa" w:w="1440"/>
+          </w:tcPr>
+          <w:p>
+            <w:pPr>
+              <w:jc w:val="center"/>
+            </w:pPr>
+            <w:r>
+              <w:rPr>
+                <w:sz w:val="20"/>
+              </w:rPr>
+              <w:t>euribor3m</w:t>
+            </w:r>
+          </w:p>
+        </w:tc>
+        <w:tc>
+          <w:tcPr>
+            <w:tcW w:type="dxa" w:w="1440"/>
+          </w:tcPr>
+          <w:p>
+            <w:pPr>
+              <w:jc w:val="center"/>
+            </w:pPr>
+            <w:r>
+              <w:rPr>
+                <w:sz w:val="20"/>
+              </w:rPr>
+              <w:t>-0.3078</w:t>
+            </w:r>
+          </w:p>
+        </w:tc>
+        <w:tc>
+          <w:tcPr>
+            <w:tcW w:type="dxa" w:w="1440"/>
+          </w:tcPr>
+          <w:p>
+            <w:pPr>
+              <w:jc w:val="center"/>
+            </w:pPr>
+            <w:r>
+              <w:rPr>
+                <w:sz w:val="20"/>
+              </w:rPr>
+              <w:t>2.12</w:t>
+            </w:r>
+          </w:p>
+        </w:tc>
+        <w:tc>
+          <w:tcPr>
+            <w:tcW w:type="dxa" w:w="1440"/>
+          </w:tcPr>
+          <w:p>
+            <w:pPr>
+              <w:jc w:val="center"/>
+            </w:pPr>
+            <w:r>
+              <w:rPr>
+                <w:sz w:val="20"/>
+              </w:rPr>
+              <w:t>3.81</w:t>
+            </w:r>
+          </w:p>
+        </w:tc>
+        <w:tc>
+          <w:tcPr>
+            <w:tcW w:type="dxa" w:w="1440"/>
+          </w:tcPr>
+          <w:p>
+            <w:pPr>
+              <w:jc w:val="center"/>
+            </w:pPr>
+            <w:r>
+              <w:rPr>
+                <w:sz w:val="20"/>
+              </w:rPr>
+              <w:t>0.00</w:t>
+            </w:r>
+          </w:p>
+        </w:tc>
+        <w:tc>
+          <w:tcPr>
+            <w:tcW w:type="dxa" w:w="1440"/>
+          </w:tcPr>
+          <w:p>
+            <w:pPr>
+              <w:jc w:val="center"/>
+            </w:pPr>
+            <w:r>
+              <w:rPr>
+                <w:sz w:val="20"/>
+              </w:rPr>
+              <w:t>FUERTE — euribor bajo = mas contrataciones</w:t>
+            </w:r>
+          </w:p>
+        </w:tc>
+      </w:tr>
+      <w:tr>
+        <w:tc>
+          <w:tcPr>
+            <w:tcW w:type="dxa" w:w="1440"/>
+          </w:tcPr>
+          <w:p>
+            <w:pPr>
+              <w:jc w:val="center"/>
+            </w:pPr>
+            <w:r>
+              <w:rPr>
+                <w:sz w:val="20"/>
+              </w:rPr>
+              <w:t>nr.employed</w:t>
+            </w:r>
+          </w:p>
+        </w:tc>
+        <w:tc>
+          <w:tcPr>
+            <w:tcW w:type="dxa" w:w="1440"/>
+          </w:tcPr>
+          <w:p>
+            <w:pPr>
+              <w:jc w:val="center"/>
+            </w:pPr>
+            <w:r>
+              <w:rPr>
+                <w:sz w:val="20"/>
+              </w:rPr>
+              <w:t>-0.3547</w:t>
+            </w:r>
+          </w:p>
+        </w:tc>
+        <w:tc>
+          <w:tcPr>
+            <w:tcW w:type="dxa" w:w="1440"/>
+          </w:tcPr>
+          <w:p>
+            <w:pPr>
+              <w:jc w:val="center"/>
+            </w:pPr>
+            <w:r>
+              <w:rPr>
+                <w:sz w:val="20"/>
+              </w:rPr>
+              <w:t>5095.1</w:t>
+            </w:r>
+          </w:p>
+        </w:tc>
+        <w:tc>
+          <w:tcPr>
+            <w:tcW w:type="dxa" w:w="1440"/>
+          </w:tcPr>
+          <w:p>
+            <w:pPr>
+              <w:jc w:val="center"/>
+            </w:pPr>
+            <w:r>
+              <w:rPr>
+                <w:sz w:val="20"/>
+              </w:rPr>
+              <w:t>5176.2</w:t>
+            </w:r>
+          </w:p>
+        </w:tc>
+        <w:tc>
+          <w:tcPr>
+            <w:tcW w:type="dxa" w:w="1440"/>
+          </w:tcPr>
+          <w:p>
+            <w:pPr>
+              <w:jc w:val="center"/>
+            </w:pPr>
+            <w:r>
+              <w:rPr>
+                <w:sz w:val="20"/>
+              </w:rPr>
+              <w:t>0.00</w:t>
+            </w:r>
+          </w:p>
+        </w:tc>
+        <w:tc>
+          <w:tcPr>
+            <w:tcW w:type="dxa" w:w="1440"/>
+          </w:tcPr>
+          <w:p>
+            <w:pPr>
+              <w:jc w:val="center"/>
+            </w:pPr>
+            <w:r>
+              <w:rPr>
+                <w:sz w:val="20"/>
+              </w:rPr>
+              <w:t>FUERTE — menos empleo = mas contrataciones</w:t>
+            </w:r>
+          </w:p>
+        </w:tc>
+      </w:tr>
+      <w:tr>
+        <w:tc>
+          <w:tcPr>
+            <w:tcW w:type="dxa" w:w="1440"/>
+          </w:tcPr>
+          <w:p>
+            <w:pPr>
+              <w:jc w:val="center"/>
+            </w:pPr>
+            <w:r>
+              <w:rPr>
+                <w:sz w:val="20"/>
+              </w:rPr>
+              <w:t>emp.var.rate</w:t>
+            </w:r>
+          </w:p>
+        </w:tc>
+        <w:tc>
+          <w:tcPr>
+            <w:tcW w:type="dxa" w:w="1440"/>
+          </w:tcPr>
+          <w:p>
+            <w:pPr>
+              <w:jc w:val="center"/>
+            </w:pPr>
+            <w:r>
+              <w:rPr>
+                <w:sz w:val="20"/>
+              </w:rPr>
+              <w:t>-0.2983</w:t>
+            </w:r>
+          </w:p>
+        </w:tc>
+        <w:tc>
+          <w:tcPr>
+            <w:tcW w:type="dxa" w:w="1440"/>
+          </w:tcPr>
+          <w:p>
+            <w:pPr>
+              <w:jc w:val="center"/>
+            </w:pPr>
+            <w:r>
+              <w:rPr>
+                <w:sz w:val="20"/>
+              </w:rPr>
+              <w:t>-1.23</w:t>
+            </w:r>
+          </w:p>
+        </w:tc>
+        <w:tc>
+          <w:tcPr>
+            <w:tcW w:type="dxa" w:w="1440"/>
+          </w:tcPr>
+          <w:p>
+            <w:pPr>
+              <w:jc w:val="center"/>
+            </w:pPr>
+            <w:r>
+              <w:rPr>
+                <w:sz w:val="20"/>
+              </w:rPr>
+              <w:t>+0.25</w:t>
+            </w:r>
+          </w:p>
+        </w:tc>
+        <w:tc>
+          <w:tcPr>
+            <w:tcW w:type="dxa" w:w="1440"/>
+          </w:tcPr>
+          <w:p>
+            <w:pPr>
+              <w:jc w:val="center"/>
+            </w:pPr>
+            <w:r>
+              <w:rPr>
+                <w:sz w:val="20"/>
+              </w:rPr>
+              <w:t>0.00</w:t>
+            </w:r>
+          </w:p>
+        </w:tc>
+        <w:tc>
+          <w:tcPr>
+            <w:tcW w:type="dxa" w:w="1440"/>
+          </w:tcPr>
+          <w:p>
+            <w:pPr>
+              <w:jc w:val="center"/>
+            </w:pPr>
+            <w:r>
+              <w:rPr>
+                <w:sz w:val="20"/>
+              </w:rPr>
+              <w:t>FUERTE — empleo en descenso = mas contrataciones</w:t>
+            </w:r>
+          </w:p>
+        </w:tc>
+      </w:tr>
+      <w:tr>
+        <w:tc>
+          <w:tcPr>
+            <w:tcW w:type="dxa" w:w="1440"/>
+          </w:tcPr>
+          <w:p>
+            <w:pPr>
+              <w:jc w:val="center"/>
+            </w:pPr>
+            <w:r>
+              <w:rPr>
+                <w:sz w:val="20"/>
+              </w:rPr>
+              <w:t>cons.price.idx</w:t>
+            </w:r>
+          </w:p>
+        </w:tc>
+        <w:tc>
+          <w:tcPr>
+            <w:tcW w:type="dxa" w:w="1440"/>
+          </w:tcPr>
+          <w:p>
+            <w:pPr>
+              <w:jc w:val="center"/>
+            </w:pPr>
+            <w:r>
+              <w:rPr>
+                <w:sz w:val="20"/>
+              </w:rPr>
+              <w:t>-0.1362</w:t>
+            </w:r>
+          </w:p>
+        </w:tc>
+        <w:tc>
+          <w:tcPr>
+            <w:tcW w:type="dxa" w:w="1440"/>
+          </w:tcPr>
+          <w:p>
+            <w:pPr>
+              <w:jc w:val="center"/>
+            </w:pPr>
+            <w:r>
+              <w:rPr>
+                <w:sz w:val="20"/>
+              </w:rPr>
+              <w:t>93.35</w:t>
+            </w:r>
+          </w:p>
+        </w:tc>
+        <w:tc>
+          <w:tcPr>
+            <w:tcW w:type="dxa" w:w="1440"/>
+          </w:tcPr>
+          <w:p>
+            <w:pPr>
+              <w:jc w:val="center"/>
+            </w:pPr>
+            <w:r>
+              <w:rPr>
+                <w:sz w:val="20"/>
+              </w:rPr>
+              <w:t>93.60</w:t>
+            </w:r>
+          </w:p>
+        </w:tc>
+        <w:tc>
+          <w:tcPr>
+            <w:tcW w:type="dxa" w:w="1440"/>
+          </w:tcPr>
+          <w:p>
+            <w:pPr>
+              <w:jc w:val="center"/>
+            </w:pPr>
+            <w:r>
+              <w:rPr>
+                <w:sz w:val="20"/>
+              </w:rPr>
+              <w:t>9.6e-136</w:t>
+            </w:r>
+          </w:p>
+        </w:tc>
+        <w:tc>
+          <w:tcPr>
+            <w:tcW w:type="dxa" w:w="1440"/>
+          </w:tcPr>
+          <w:p>
+            <w:pPr>
+              <w:jc w:val="center"/>
+            </w:pPr>
+            <w:r>
+              <w:rPr>
+                <w:sz w:val="20"/>
+              </w:rPr>
+              <w:t>MODERADO — precios bajos = mas contrataciones</w:t>
+            </w:r>
+          </w:p>
+        </w:tc>
+      </w:tr>
+      <w:tr>
+        <w:tc>
+          <w:tcPr>
+            <w:tcW w:type="dxa" w:w="1440"/>
+          </w:tcPr>
+          <w:p>
+            <w:pPr>
+              <w:jc w:val="center"/>
+            </w:pPr>
+            <w:r>
+              <w:rPr>
+                <w:sz w:val="20"/>
+              </w:rPr>
+              <w:t>cons.conf.idx</w:t>
+            </w:r>
+          </w:p>
+        </w:tc>
+        <w:tc>
+          <w:tcPr>
+            <w:tcW w:type="dxa" w:w="1440"/>
+          </w:tcPr>
+          <w:p>
+            <w:pPr>
+              <w:jc w:val="center"/>
+            </w:pPr>
+            <w:r>
+              <w:rPr>
+                <w:sz w:val="20"/>
+              </w:rPr>
+              <w:t>+0.0549</w:t>
+            </w:r>
+          </w:p>
+        </w:tc>
+        <w:tc>
+          <w:tcPr>
+            <w:tcW w:type="dxa" w:w="1440"/>
+          </w:tcPr>
+          <w:p>
+            <w:pPr>
+              <w:jc w:val="center"/>
+            </w:pPr>
+            <w:r>
+              <w:rPr>
+                <w:sz w:val="20"/>
+              </w:rPr>
+              <w:t>-39.79</w:t>
+            </w:r>
+          </w:p>
+        </w:tc>
+        <w:tc>
+          <w:tcPr>
+            <w:tcW w:type="dxa" w:w="1440"/>
+          </w:tcPr>
+          <w:p>
+            <w:pPr>
+              <w:jc w:val="center"/>
+            </w:pPr>
+            <w:r>
+              <w:rPr>
+                <w:sz w:val="20"/>
+              </w:rPr>
+              <w:t>-40.59</w:t>
+            </w:r>
+          </w:p>
+        </w:tc>
+        <w:tc>
+          <w:tcPr>
+            <w:tcW w:type="dxa" w:w="1440"/>
+          </w:tcPr>
+          <w:p>
+            <w:pPr>
+              <w:jc w:val="center"/>
+            </w:pPr>
+            <w:r>
+              <w:rPr>
+                <w:sz w:val="20"/>
+              </w:rPr>
+              <w:t>5.9e-17</w:t>
+            </w:r>
+          </w:p>
+        </w:tc>
+        <w:tc>
+          <w:tcPr>
+            <w:tcW w:type="dxa" w:w="1440"/>
+          </w:tcPr>
+          <w:p>
+            <w:pPr>
+              <w:jc w:val="center"/>
+            </w:pPr>
+            <w:r>
+              <w:rPr>
+                <w:sz w:val="20"/>
+              </w:rPr>
+              <w:t>DEBIL — efecto minimo (r=0.05)</w:t>
+            </w:r>
+          </w:p>
+        </w:tc>
+      </w:tr>
+    </w:tbl>
+    <w:p/>
+    <w:p>
+      <w:r>
+        <w:rPr>
+          <w:b/>
+        </w:rPr>
+        <w:t xml:space="preserve">Sobre cons.conf.idx: </w:t>
+      </w:r>
+      <w:r>
+        <w:t>Es estadisticamente significativa (p &lt; 0.001) pero con el efecto mas debil de las 5 (r=+0.05). Esto es normal: el indice de confianza mide sentimiento, pero los depositos a plazo son productos de refugio que se contratan mas cuando hay incertidumbre, no mas confianza. Por eso euribor3m y nr.employed (indicadores duros) tienen 6x mas correlacion.</w:t>
+      </w:r>
+    </w:p>
+    <w:p/>
+    <w:p>
+      <w:r>
+        <w:rPr>
+          <w:b/>
+        </w:rPr>
+        <w:t xml:space="preserve">Multicolinealidad: </w:t>
+      </w:r>
+      <w:r>
+        <w:t>emp.var.rate, euribor3m y nr.employed estan correlacionadas entre si con r &gt; 0.90. Para el modelo, usar solo euribor3m o aplicar PCA.</w:t>
       </w:r>
     </w:p>
     <w:p>
@@ -1221,6 +2294,22 @@
     </w:p>
     <w:p>
       <w:pPr>
+        <w:pStyle w:val="ListBullet"/>
+      </w:pPr>
+      <w:r>
+        <w:t>age tiene relacion no lineal — usar bins o transformacion polinomica en el modelo</w:t>
+      </w:r>
+    </w:p>
+    <w:p>
+      <w:pPr>
+        <w:pStyle w:val="ListBullet"/>
+      </w:pPr>
+      <w:r>
+        <w:t>cons.conf.idx es significativa pero debil (r=0.05) — incluir pero no esperar gran aporte</w:t>
+      </w:r>
+    </w:p>
+    <w:p>
+      <w:pPr>
         <w:pStyle w:val="Heading1"/>
       </w:pPr>
       <w:r>
@@ -1229,7 +2318,7 @@
     </w:p>
     <w:p>
       <w:r>
-        <w:t>La Tarea 1 revela que el exito de la campana depende principalmente de: (1) el historial previo del cliente, (2) el contexto macroeconomico, (3) el perfil demografico y (4) la estrategia de contacto (metodo, frecuencia, timing). Estos hallazgos guiaran la construccion del modelo predictivo en la Tarea 3.</w:t>
+        <w:t>La Tarea 1 revela que el exito de la campana depende de: (1) el historial previo del cliente (poutcome=success: 65%), (2) el contexto macroeconomico (euribor, empleo — depositos como refugio), (3) el perfil demografico (edad en U, students/retired) y (4) la estrategia de contacto (celular, max 3 intentos). Todas las variables fueron analizadas con tests estadisticos formales.</w:t>
       </w:r>
     </w:p>
     <w:sectPr>

</xml_diff>